<commit_message>
Expand final report with simulation results and figures
</commit_message>
<xml_diff>
--- a/Case_Study_Report.docx
+++ b/Case_Study_Report.docx
@@ -160,6 +160,14 @@
       </w:pPr>
       <w:r>
         <w:t>3. Technical Reconstruction</w:t>
+      </w:r>
+    </w:p>
+    <w:p>
+      <w:pPr>
+        <w:pStyle w:val="ListBullet"/>
+      </w:pPr>
+      <w:r>
+        <w:t>3.4 Offline Simulation and Results</w:t>
       </w:r>
     </w:p>
     <w:p>
@@ -1139,6 +1147,963 @@
       <w:r>
         <w:t>It can still disrupt availability by dropping or delaying traffic. Properly authenticated TLS can protect confidentiality and integrity, not guarantee availability.</w:t>
       </w:r>
+    </w:p>
+    <w:p>
+      <w:pPr>
+        <w:pStyle w:val="Heading2"/>
+        <w:keepNext/>
+      </w:pPr>
+      <w:r>
+        <w:t>3.4 Offline Simulation and Results</w:t>
+      </w:r>
+    </w:p>
+    <w:p>
+      <w:pPr/>
+      <w:r>
+        <w:t>To make the case study’s technical claims easier to demonstrate, the team built a small deterministic offline model. It compares how a gateway-mapping attack behaves with clear-text HTTP, with correctly validated TLS, and with switch-side Dynamic ARP Inspection (DAI) backed by DHCP snooping. The code is a teaching model; it is not a packet-level reproduction of the Ashwin Holdings scenario and does not test a live network.</w:t>
+      </w:r>
+    </w:p>
+    <w:p>
+      <w:pPr/>
+      <w:r>
+        <w:t>The runner is run_lab.py in the public project repository. It uses eight synthetic finance endpoints (192.168.40.51–58), three synthetic sensitive flows per endpoint per condition, and two false gateway claims per endpoint to represent the two traffic directions. Thus each condition has 24 synthetic flows and the attack conditions model 16 forged claims. In the HTTP condition, one flow per redirected endpoint is treated as a credential-bearing login; the other two are illustrative payment-related flows. No real credentials or user data are present.</w:t>
+      </w:r>
+    </w:p>
+    <w:p>
+      <w:pPr/>
+      <w:r>
+        <w:t>The script opens no network sockets and sends no ARP frames. It writes scenario_results.csv, event_log.csv, ssl_downgrade_examples.csv and run_metadata.json, then generates six PNG figures. The event log and figures are rendered from the model’s state transitions; they are not PCAP evidence, switch telemetry or observed endpoint screenshots.</w:t>
+      </w:r>
+    </w:p>
+    <w:p>
+      <w:pPr/>
+      <w:r>
+        <w:t>To reproduce the outputs, install the dependency listed in requirements.txt if Pillow is not already available, then run the following commands from the repository root:</w:t>
+      </w:r>
+    </w:p>
+    <w:p>
+      <w:pPr/>
+      <w:r>
+        <w:rPr>
+          <w:rFonts w:ascii="Consolas" w:hAnsi="Consolas"/>
+          <w:color w:val="1F435F"/>
+          <w:sz w:val="18"/>
+        </w:rPr>
+        <w:t>python -m pip install -r requirements.txt</w:t>
+        <w:br/>
+        <w:t>python run_lab.py</w:t>
+      </w:r>
+    </w:p>
+    <w:p>
+      <w:pPr/>
+      <w:r>
+        <w:t>The model produced these condition-level results:</w:t>
+      </w:r>
+    </w:p>
+    <w:tbl>
+      <w:tblPr>
+        <w:tblStyle w:val="TableGrid"/>
+        <w:tblW w:type="auto" w:w="0"/>
+        <w:tblLook w:firstColumn="1" w:firstRow="1" w:lastColumn="0" w:lastRow="0" w:noHBand="0" w:noVBand="1" w:val="04A0"/>
+      </w:tblPr>
+      <w:tblGrid>
+        <w:gridCol w:w="1976"/>
+        <w:gridCol w:w="1976"/>
+        <w:gridCol w:w="1976"/>
+        <w:gridCol w:w="1976"/>
+        <w:gridCol w:w="1976"/>
+      </w:tblGrid>
+      <w:tr>
+        <w:tc>
+          <w:tcPr>
+            <w:tcW w:type="dxa" w:w="2952"/>
+            <w:shd w:fill="16324F"/>
+          </w:tcPr>
+          <w:p>
+            <w:r>
+              <w:rPr>
+                <w:b/>
+                <w:color w:val="FFFFFF"/>
+                <w:sz w:val="16"/>
+              </w:rPr>
+              <w:t>Condition</w:t>
+            </w:r>
+          </w:p>
+        </w:tc>
+        <w:tc>
+          <w:tcPr>
+            <w:tcW w:type="dxa" w:w="1368"/>
+            <w:shd w:fill="16324F"/>
+          </w:tcPr>
+          <w:p>
+            <w:r>
+              <w:rPr>
+                <w:b/>
+                <w:color w:val="FFFFFF"/>
+                <w:sz w:val="16"/>
+              </w:rPr>
+              <w:t>Hosts redirected</w:t>
+            </w:r>
+          </w:p>
+        </w:tc>
+        <w:tc>
+          <w:tcPr>
+            <w:tcW w:type="dxa" w:w="1555"/>
+            <w:shd w:fill="16324F"/>
+          </w:tcPr>
+          <w:p>
+            <w:r>
+              <w:rPr>
+                <w:b/>
+                <w:color w:val="FFFFFF"/>
+                <w:sz w:val="16"/>
+              </w:rPr>
+              <w:t>Clear-text flows visible</w:t>
+            </w:r>
+          </w:p>
+        </w:tc>
+        <w:tc>
+          <w:tcPr>
+            <w:tcW w:type="dxa" w:w="1555"/>
+            <w:shd w:fill="16324F"/>
+          </w:tcPr>
+          <w:p>
+            <w:r>
+              <w:rPr>
+                <w:b/>
+                <w:color w:val="FFFFFF"/>
+                <w:sz w:val="16"/>
+              </w:rPr>
+              <w:t>Synthetic logins exposed</w:t>
+            </w:r>
+          </w:p>
+        </w:tc>
+        <w:tc>
+          <w:tcPr>
+            <w:tcW w:type="dxa" w:w="1613"/>
+            <w:shd w:fill="16324F"/>
+          </w:tcPr>
+          <w:p>
+            <w:r>
+              <w:rPr>
+                <w:b/>
+                <w:color w:val="FFFFFF"/>
+                <w:sz w:val="16"/>
+              </w:rPr>
+              <w:t>False ARP claims dropped</w:t>
+            </w:r>
+          </w:p>
+        </w:tc>
+      </w:tr>
+      <w:tr>
+        <w:tc>
+          <w:tcPr>
+            <w:tcW w:type="dxa" w:w="2952"/>
+          </w:tcPr>
+          <w:p>
+            <w:pPr>
+              <w:spacing w:before="40" w:after="40"/>
+            </w:pPr>
+            <w:r>
+              <w:rPr>
+                <w:sz w:val="16"/>
+              </w:rPr>
+              <w:t>Baseline / no attacker</w:t>
+            </w:r>
+          </w:p>
+        </w:tc>
+        <w:tc>
+          <w:tcPr>
+            <w:tcW w:type="dxa" w:w="1368"/>
+          </w:tcPr>
+          <w:p>
+            <w:pPr>
+              <w:spacing w:before="40" w:after="40"/>
+            </w:pPr>
+            <w:r>
+              <w:rPr>
+                <w:sz w:val="16"/>
+              </w:rPr>
+              <w:t>0</w:t>
+            </w:r>
+          </w:p>
+        </w:tc>
+        <w:tc>
+          <w:tcPr>
+            <w:tcW w:type="dxa" w:w="1555"/>
+          </w:tcPr>
+          <w:p>
+            <w:pPr>
+              <w:spacing w:before="40" w:after="40"/>
+            </w:pPr>
+            <w:r>
+              <w:rPr>
+                <w:sz w:val="16"/>
+              </w:rPr>
+              <w:t>0</w:t>
+            </w:r>
+          </w:p>
+        </w:tc>
+        <w:tc>
+          <w:tcPr>
+            <w:tcW w:type="dxa" w:w="1555"/>
+          </w:tcPr>
+          <w:p>
+            <w:pPr>
+              <w:spacing w:before="40" w:after="40"/>
+            </w:pPr>
+            <w:r>
+              <w:rPr>
+                <w:sz w:val="16"/>
+              </w:rPr>
+              <w:t>0</w:t>
+            </w:r>
+          </w:p>
+        </w:tc>
+        <w:tc>
+          <w:tcPr>
+            <w:tcW w:type="dxa" w:w="1613"/>
+          </w:tcPr>
+          <w:p>
+            <w:pPr>
+              <w:spacing w:before="40" w:after="40"/>
+            </w:pPr>
+            <w:r>
+              <w:rPr>
+                <w:sz w:val="16"/>
+              </w:rPr>
+              <w:t>0</w:t>
+            </w:r>
+          </w:p>
+        </w:tc>
+      </w:tr>
+      <w:tr>
+        <w:tc>
+          <w:tcPr>
+            <w:tcW w:type="dxa" w:w="2952"/>
+          </w:tcPr>
+          <w:p>
+            <w:pPr>
+              <w:spacing w:before="40" w:after="40"/>
+            </w:pPr>
+            <w:r>
+              <w:rPr>
+                <w:sz w:val="16"/>
+              </w:rPr>
+              <w:t>ARP MITM / HTTP</w:t>
+            </w:r>
+          </w:p>
+        </w:tc>
+        <w:tc>
+          <w:tcPr>
+            <w:tcW w:type="dxa" w:w="1368"/>
+          </w:tcPr>
+          <w:p>
+            <w:pPr>
+              <w:spacing w:before="40" w:after="40"/>
+            </w:pPr>
+            <w:r>
+              <w:rPr>
+                <w:sz w:val="16"/>
+              </w:rPr>
+              <w:t>8</w:t>
+            </w:r>
+          </w:p>
+        </w:tc>
+        <w:tc>
+          <w:tcPr>
+            <w:tcW w:type="dxa" w:w="1555"/>
+          </w:tcPr>
+          <w:p>
+            <w:pPr>
+              <w:spacing w:before="40" w:after="40"/>
+            </w:pPr>
+            <w:r>
+              <w:rPr>
+                <w:sz w:val="16"/>
+              </w:rPr>
+              <w:t>24</w:t>
+            </w:r>
+          </w:p>
+        </w:tc>
+        <w:tc>
+          <w:tcPr>
+            <w:tcW w:type="dxa" w:w="1555"/>
+          </w:tcPr>
+          <w:p>
+            <w:pPr>
+              <w:spacing w:before="40" w:after="40"/>
+            </w:pPr>
+            <w:r>
+              <w:rPr>
+                <w:sz w:val="16"/>
+              </w:rPr>
+              <w:t>8</w:t>
+            </w:r>
+          </w:p>
+        </w:tc>
+        <w:tc>
+          <w:tcPr>
+            <w:tcW w:type="dxa" w:w="1613"/>
+          </w:tcPr>
+          <w:p>
+            <w:pPr>
+              <w:spacing w:before="40" w:after="40"/>
+            </w:pPr>
+            <w:r>
+              <w:rPr>
+                <w:sz w:val="16"/>
+              </w:rPr>
+              <w:t>0</w:t>
+            </w:r>
+          </w:p>
+        </w:tc>
+      </w:tr>
+      <w:tr>
+        <w:tc>
+          <w:tcPr>
+            <w:tcW w:type="dxa" w:w="2952"/>
+          </w:tcPr>
+          <w:p>
+            <w:pPr>
+              <w:spacing w:before="40" w:after="40"/>
+            </w:pPr>
+            <w:r>
+              <w:rPr>
+                <w:sz w:val="16"/>
+              </w:rPr>
+              <w:t>ARP MITM / TLS validated</w:t>
+            </w:r>
+          </w:p>
+        </w:tc>
+        <w:tc>
+          <w:tcPr>
+            <w:tcW w:type="dxa" w:w="1368"/>
+          </w:tcPr>
+          <w:p>
+            <w:pPr>
+              <w:spacing w:before="40" w:after="40"/>
+            </w:pPr>
+            <w:r>
+              <w:rPr>
+                <w:sz w:val="16"/>
+              </w:rPr>
+              <w:t>8</w:t>
+            </w:r>
+          </w:p>
+        </w:tc>
+        <w:tc>
+          <w:tcPr>
+            <w:tcW w:type="dxa" w:w="1555"/>
+          </w:tcPr>
+          <w:p>
+            <w:pPr>
+              <w:spacing w:before="40" w:after="40"/>
+            </w:pPr>
+            <w:r>
+              <w:rPr>
+                <w:sz w:val="16"/>
+              </w:rPr>
+              <w:t>0</w:t>
+            </w:r>
+          </w:p>
+        </w:tc>
+        <w:tc>
+          <w:tcPr>
+            <w:tcW w:type="dxa" w:w="1555"/>
+          </w:tcPr>
+          <w:p>
+            <w:pPr>
+              <w:spacing w:before="40" w:after="40"/>
+            </w:pPr>
+            <w:r>
+              <w:rPr>
+                <w:sz w:val="16"/>
+              </w:rPr>
+              <w:t>0</w:t>
+            </w:r>
+          </w:p>
+        </w:tc>
+        <w:tc>
+          <w:tcPr>
+            <w:tcW w:type="dxa" w:w="1613"/>
+          </w:tcPr>
+          <w:p>
+            <w:pPr>
+              <w:spacing w:before="40" w:after="40"/>
+            </w:pPr>
+            <w:r>
+              <w:rPr>
+                <w:sz w:val="16"/>
+              </w:rPr>
+              <w:t>0</w:t>
+            </w:r>
+          </w:p>
+        </w:tc>
+      </w:tr>
+      <w:tr>
+        <w:tc>
+          <w:tcPr>
+            <w:tcW w:type="dxa" w:w="2952"/>
+          </w:tcPr>
+          <w:p>
+            <w:pPr>
+              <w:spacing w:before="40" w:after="40"/>
+            </w:pPr>
+            <w:r>
+              <w:rPr>
+                <w:sz w:val="16"/>
+              </w:rPr>
+              <w:t>DAI + snooping / HTTP</w:t>
+            </w:r>
+          </w:p>
+        </w:tc>
+        <w:tc>
+          <w:tcPr>
+            <w:tcW w:type="dxa" w:w="1368"/>
+          </w:tcPr>
+          <w:p>
+            <w:pPr>
+              <w:spacing w:before="40" w:after="40"/>
+            </w:pPr>
+            <w:r>
+              <w:rPr>
+                <w:sz w:val="16"/>
+              </w:rPr>
+              <w:t>0</w:t>
+            </w:r>
+          </w:p>
+        </w:tc>
+        <w:tc>
+          <w:tcPr>
+            <w:tcW w:type="dxa" w:w="1555"/>
+          </w:tcPr>
+          <w:p>
+            <w:pPr>
+              <w:spacing w:before="40" w:after="40"/>
+            </w:pPr>
+            <w:r>
+              <w:rPr>
+                <w:sz w:val="16"/>
+              </w:rPr>
+              <w:t>0</w:t>
+            </w:r>
+          </w:p>
+        </w:tc>
+        <w:tc>
+          <w:tcPr>
+            <w:tcW w:type="dxa" w:w="1555"/>
+          </w:tcPr>
+          <w:p>
+            <w:pPr>
+              <w:spacing w:before="40" w:after="40"/>
+            </w:pPr>
+            <w:r>
+              <w:rPr>
+                <w:sz w:val="16"/>
+              </w:rPr>
+              <w:t>0</w:t>
+            </w:r>
+          </w:p>
+        </w:tc>
+        <w:tc>
+          <w:tcPr>
+            <w:tcW w:type="dxa" w:w="1613"/>
+          </w:tcPr>
+          <w:p>
+            <w:pPr>
+              <w:spacing w:before="40" w:after="40"/>
+            </w:pPr>
+            <w:r>
+              <w:rPr>
+                <w:sz w:val="16"/>
+              </w:rPr>
+              <w:t>16</w:t>
+            </w:r>
+          </w:p>
+        </w:tc>
+      </w:tr>
+      <w:tr>
+        <w:tc>
+          <w:tcPr>
+            <w:tcW w:type="dxa" w:w="2952"/>
+          </w:tcPr>
+          <w:p>
+            <w:pPr>
+              <w:spacing w:before="40" w:after="40"/>
+            </w:pPr>
+            <w:r>
+              <w:rPr>
+                <w:sz w:val="16"/>
+              </w:rPr>
+              <w:t>Layered: DAI + TLS + HSTS</w:t>
+            </w:r>
+          </w:p>
+        </w:tc>
+        <w:tc>
+          <w:tcPr>
+            <w:tcW w:type="dxa" w:w="1368"/>
+          </w:tcPr>
+          <w:p>
+            <w:pPr>
+              <w:spacing w:before="40" w:after="40"/>
+            </w:pPr>
+            <w:r>
+              <w:rPr>
+                <w:sz w:val="16"/>
+              </w:rPr>
+              <w:t>0</w:t>
+            </w:r>
+          </w:p>
+        </w:tc>
+        <w:tc>
+          <w:tcPr>
+            <w:tcW w:type="dxa" w:w="1555"/>
+          </w:tcPr>
+          <w:p>
+            <w:pPr>
+              <w:spacing w:before="40" w:after="40"/>
+            </w:pPr>
+            <w:r>
+              <w:rPr>
+                <w:sz w:val="16"/>
+              </w:rPr>
+              <w:t>0</w:t>
+            </w:r>
+          </w:p>
+        </w:tc>
+        <w:tc>
+          <w:tcPr>
+            <w:tcW w:type="dxa" w:w="1555"/>
+          </w:tcPr>
+          <w:p>
+            <w:pPr>
+              <w:spacing w:before="40" w:after="40"/>
+            </w:pPr>
+            <w:r>
+              <w:rPr>
+                <w:sz w:val="16"/>
+              </w:rPr>
+              <w:t>0</w:t>
+            </w:r>
+          </w:p>
+        </w:tc>
+        <w:tc>
+          <w:tcPr>
+            <w:tcW w:type="dxa" w:w="1613"/>
+          </w:tcPr>
+          <w:p>
+            <w:pPr>
+              <w:spacing w:before="40" w:after="40"/>
+            </w:pPr>
+            <w:r>
+              <w:rPr>
+                <w:sz w:val="16"/>
+              </w:rPr>
+              <w:t>16</w:t>
+            </w:r>
+          </w:p>
+        </w:tc>
+      </w:tr>
+    </w:tbl>
+    <w:p>
+      <w:pPr/>
+      <w:r/>
+    </w:p>
+    <w:p>
+      <w:pPr/>
+      <w:r>
+        <w:t>In the HTTP case, all eight synthetic hosts accept the false mapping, so all 24 modeled flows become visible in clear text. Eight credential-bearing login fields are exposed in the model—one per endpoint—not eight real victims in the source case. The other 16 visible flows are synthetic payment-related examples. Because HTTP has no authenticated encryption, the model marks application payload alteration as possible and service disruption as possible.</w:t>
+      </w:r>
+    </w:p>
+    <w:p>
+      <w:pPr/>
+      <w:r>
+        <w:t>With correctly validated TLS, the same 16 forged claims are accepted and eight hosts are redirected, but none of the 24 application payloads or synthetic credentials is exposed. The model counts 24 intercepted TLS flows as having observable network metadata (such as timing and size); it does not imply that all connection metadata or payload content is readable. The on-path attacker can still drop traffic, so availability is not guaranteed.</w:t>
+      </w:r>
+    </w:p>
+    <w:p>
+      <w:pPr/>
+      <w:r>
+        <w:t>With DHCP snooping bindings and DAI configured correctly, the model drops all 16 false claims before any host mapping changes. No hosts are redirected and no synthetic credentials are exposed. This outcome assumes the binding policy correctly represents authorized devices, gateway addresses and any static-IP exceptions. A bad or incomplete binding database can cause false drops or weaken validation.</w:t>
+      </w:r>
+    </w:p>
+    <w:p>
+      <w:pPr/>
+      <w:r>
+        <w:t>The separate SSL downgrade file compares only two simplified client profiles: a legacy profile that permits HTTP fallback and a browser profile with an active HSTS policy that blocks HTTP. This is not an execution of SSL-stripping software or a test of a real mobile application. HSTS first-contact protection depends on prior policy learning or preload; TLS and certificate validation must already be correctly implemented.</w:t>
+      </w:r>
+    </w:p>
+    <w:p>
+      <w:pPr/>
+      <w:r>
+        <w:t>The results support the case study’s defense-in-depth conclusion: DAI addresses the local false-mapping path, while validated TLS protects application data if interception still occurs. They are illustrative model outputs, not measurements from Ashwin Holdings, not proof that the described breach occurred, and not a replacement for authorized packet captures or switch testing.</w:t>
+      </w:r>
+    </w:p>
+    <w:p>
+      <w:pPr/>
+      <w:r>
+        <w:t>Figures 1–6 show the run outputs. All addresses and counts are synthetic; the rendered terminal-style figure is generated for presentation and is not a live terminal screenshot.</w:t>
+      </w:r>
+    </w:p>
+    <w:p>
+      <w:pPr>
+        <w:keepLines/>
+        <w:pageBreakBefore/>
+        <w:jc w:val="center"/>
+      </w:pPr>
+      <w:r>
+        <w:drawing>
+          <wp:inline xmlns:a="http://schemas.openxmlformats.org/drawingml/2006/main" xmlns:pic="http://schemas.openxmlformats.org/drawingml/2006/picture">
+            <wp:extent cx="5715000" cy="3571875"/>
+            <wp:docPr id="1" name="Picture 1"/>
+            <wp:cNvGraphicFramePr>
+              <a:graphicFrameLocks noChangeAspect="1"/>
+            </wp:cNvGraphicFramePr>
+            <a:graphic>
+              <a:graphicData uri="http://schemas.openxmlformats.org/drawingml/2006/picture">
+                <pic:pic>
+                  <pic:nvPicPr>
+                    <pic:cNvPr id="0" name="01_simulation_results.png"/>
+                    <pic:cNvPicPr/>
+                  </pic:nvPicPr>
+                  <pic:blipFill>
+                    <a:blip r:embed="rId10"/>
+                    <a:stretch>
+                      <a:fillRect/>
+                    </a:stretch>
+                  </pic:blipFill>
+                  <pic:spPr>
+                    <a:xfrm>
+                      <a:off x="0" y="0"/>
+                      <a:ext cx="5715000" cy="3571875"/>
+                    </a:xfrm>
+                    <a:prstGeom prst="rect"/>
+                  </pic:spPr>
+                </pic:pic>
+              </a:graphicData>
+            </a:graphic>
+          </wp:inline>
+        </w:drawing>
+      </w:r>
+    </w:p>
+    <w:p>
+      <w:pPr>
+        <w:keepLines/>
+        <w:spacing w:before="100" w:after="200"/>
+        <w:jc w:val="center"/>
+      </w:pPr>
+      <w:r>
+        <w:rPr>
+          <w:i/>
+          <w:color w:val="4B5763"/>
+          <w:sz w:val="18"/>
+        </w:rPr>
+        <w:t>Figure 1. Simulation dashboard comparing redirection and synthetic credential exposure across the five modeled conditions.</w:t>
+      </w:r>
+    </w:p>
+    <w:p>
+      <w:pPr>
+        <w:keepLines/>
+        <w:pageBreakBefore/>
+        <w:jc w:val="center"/>
+      </w:pPr>
+      <w:r>
+        <w:drawing>
+          <wp:inline xmlns:a="http://schemas.openxmlformats.org/drawingml/2006/main" xmlns:pic="http://schemas.openxmlformats.org/drawingml/2006/picture">
+            <wp:extent cx="5715000" cy="3214688"/>
+            <wp:docPr id="2" name="Picture 2"/>
+            <wp:cNvGraphicFramePr>
+              <a:graphicFrameLocks noChangeAspect="1"/>
+            </wp:cNvGraphicFramePr>
+            <a:graphic>
+              <a:graphicData uri="http://schemas.openxmlformats.org/drawingml/2006/picture">
+                <pic:pic>
+                  <pic:nvPicPr>
+                    <pic:cNvPr id="0" name="02_frame_change.png"/>
+                    <pic:cNvPicPr/>
+                  </pic:nvPicPr>
+                  <pic:blipFill>
+                    <a:blip r:embed="rId11"/>
+                    <a:stretch>
+                      <a:fillRect/>
+                    </a:stretch>
+                  </pic:blipFill>
+                  <pic:spPr>
+                    <a:xfrm>
+                      <a:off x="0" y="0"/>
+                      <a:ext cx="5715000" cy="3214688"/>
+                    </a:xfrm>
+                    <a:prstGeom prst="rect"/>
+                  </pic:spPr>
+                </pic:pic>
+              </a:graphicData>
+            </a:graphic>
+          </wp:inline>
+        </w:drawing>
+      </w:r>
+    </w:p>
+    <w:p>
+      <w:pPr>
+        <w:keepLines/>
+        <w:spacing w:before="100" w:after="200"/>
+        <w:jc w:val="center"/>
+      </w:pPr>
+      <w:r>
+        <w:rPr>
+          <w:i/>
+          <w:color w:val="4B5763"/>
+          <w:sz w:val="18"/>
+        </w:rPr>
+        <w:t>Figure 2. Frame-level comparison: the Ethernet destination MAC changes to the attacker, while the IP endpoints remain unchanged. Addresses are illustrative.</w:t>
+      </w:r>
+    </w:p>
+    <w:p>
+      <w:pPr>
+        <w:keepLines/>
+        <w:pageBreakBefore/>
+        <w:jc w:val="center"/>
+      </w:pPr>
+      <w:r>
+        <w:drawing>
+          <wp:inline xmlns:a="http://schemas.openxmlformats.org/drawingml/2006/main" xmlns:pic="http://schemas.openxmlformats.org/drawingml/2006/picture">
+            <wp:extent cx="5715000" cy="3214688"/>
+            <wp:docPr id="3" name="Picture 3"/>
+            <wp:cNvGraphicFramePr>
+              <a:graphicFrameLocks noChangeAspect="1"/>
+            </wp:cNvGraphicFramePr>
+            <a:graphic>
+              <a:graphicData uri="http://schemas.openxmlformats.org/drawingml/2006/picture">
+                <pic:pic>
+                  <pic:nvPicPr>
+                    <pic:cNvPr id="0" name="03_defense_comparison.png"/>
+                    <pic:cNvPicPr/>
+                  </pic:nvPicPr>
+                  <pic:blipFill>
+                    <a:blip r:embed="rId12"/>
+                    <a:stretch>
+                      <a:fillRect/>
+                    </a:stretch>
+                  </pic:blipFill>
+                  <pic:spPr>
+                    <a:xfrm>
+                      <a:off x="0" y="0"/>
+                      <a:ext cx="5715000" cy="3214688"/>
+                    </a:xfrm>
+                    <a:prstGeom prst="rect"/>
+                  </pic:spPr>
+                </pic:pic>
+              </a:graphicData>
+            </a:graphic>
+          </wp:inline>
+        </w:drawing>
+      </w:r>
+    </w:p>
+    <w:p>
+      <w:pPr>
+        <w:keepLines/>
+        <w:spacing w:before="100" w:after="200"/>
+        <w:jc w:val="center"/>
+      </w:pPr>
+      <w:r>
+        <w:rPr>
+          <w:i/>
+          <w:color w:val="4B5763"/>
+          <w:sz w:val="18"/>
+        </w:rPr>
+        <w:t>Figure 3. Control comparison for redirection, credential exposure, DAI drops, and modeled integrity/availability risks.</w:t>
+      </w:r>
+    </w:p>
+    <w:p>
+      <w:pPr>
+        <w:keepLines/>
+        <w:pageBreakBefore/>
+        <w:jc w:val="center"/>
+      </w:pPr>
+      <w:r>
+        <w:drawing>
+          <wp:inline xmlns:a="http://schemas.openxmlformats.org/drawingml/2006/main" xmlns:pic="http://schemas.openxmlformats.org/drawingml/2006/picture">
+            <wp:extent cx="5715000" cy="2895600"/>
+            <wp:docPr id="4" name="Picture 4"/>
+            <wp:cNvGraphicFramePr>
+              <a:graphicFrameLocks noChangeAspect="1"/>
+            </wp:cNvGraphicFramePr>
+            <a:graphic>
+              <a:graphicData uri="http://schemas.openxmlformats.org/drawingml/2006/picture">
+                <pic:pic>
+                  <pic:nvPicPr>
+                    <pic:cNvPr id="0" name="04_terminal_results.png"/>
+                    <pic:cNvPicPr/>
+                  </pic:nvPicPr>
+                  <pic:blipFill>
+                    <a:blip r:embed="rId13"/>
+                    <a:stretch>
+                      <a:fillRect/>
+                    </a:stretch>
+                  </pic:blipFill>
+                  <pic:spPr>
+                    <a:xfrm>
+                      <a:off x="0" y="0"/>
+                      <a:ext cx="5715000" cy="2895600"/>
+                    </a:xfrm>
+                    <a:prstGeom prst="rect"/>
+                  </pic:spPr>
+                </pic:pic>
+              </a:graphicData>
+            </a:graphic>
+          </wp:inline>
+        </w:drawing>
+      </w:r>
+    </w:p>
+    <w:p>
+      <w:pPr>
+        <w:keepLines/>
+        <w:spacing w:before="100" w:after="200"/>
+        <w:jc w:val="center"/>
+      </w:pPr>
+      <w:r>
+        <w:rPr>
+          <w:i/>
+          <w:color w:val="4B5763"/>
+          <w:sz w:val="18"/>
+        </w:rPr>
+        <w:t>Figure 4. Presentation rendering of the script’s command-line summary; the accompanying simulation_run.txt contains the actual local run output.</w:t>
+      </w:r>
+    </w:p>
+    <w:p>
+      <w:pPr>
+        <w:keepLines/>
+        <w:pageBreakBefore/>
+        <w:jc w:val="center"/>
+      </w:pPr>
+      <w:r>
+        <w:drawing>
+          <wp:inline xmlns:a="http://schemas.openxmlformats.org/drawingml/2006/main" xmlns:pic="http://schemas.openxmlformats.org/drawingml/2006/picture">
+            <wp:extent cx="5715000" cy="3036094"/>
+            <wp:docPr id="5" name="Picture 5"/>
+            <wp:cNvGraphicFramePr>
+              <a:graphicFrameLocks noChangeAspect="1"/>
+            </wp:cNvGraphicFramePr>
+            <a:graphic>
+              <a:graphicData uri="http://schemas.openxmlformats.org/drawingml/2006/picture">
+                <pic:pic>
+                  <pic:nvPicPr>
+                    <pic:cNvPr id="0" name="05_host_scenario_heatmap.png"/>
+                    <pic:cNvPicPr/>
+                  </pic:nvPicPr>
+                  <pic:blipFill>
+                    <a:blip r:embed="rId14"/>
+                    <a:stretch>
+                      <a:fillRect/>
+                    </a:stretch>
+                  </pic:blipFill>
+                  <pic:spPr>
+                    <a:xfrm>
+                      <a:off x="0" y="0"/>
+                      <a:ext cx="5715000" cy="3036094"/>
+                    </a:xfrm>
+                    <a:prstGeom prst="rect"/>
+                  </pic:spPr>
+                </pic:pic>
+              </a:graphicData>
+            </a:graphic>
+          </wp:inline>
+        </w:drawing>
+      </w:r>
+    </w:p>
+    <w:p>
+      <w:pPr>
+        <w:keepLines/>
+        <w:spacing w:before="100" w:after="200"/>
+        <w:jc w:val="center"/>
+      </w:pPr>
+      <w:r>
+        <w:rPr>
+          <w:i/>
+          <w:color w:val="4B5763"/>
+          <w:sz w:val="18"/>
+        </w:rPr>
+        <w:t>Figure 5. Host-by-scenario heatmap. The eight synthetic endpoints share the same modeled outcome by design.</w:t>
+      </w:r>
+    </w:p>
+    <w:p>
+      <w:pPr>
+        <w:keepLines/>
+        <w:pageBreakBefore/>
+        <w:jc w:val="center"/>
+      </w:pPr>
+      <w:r>
+        <w:drawing>
+          <wp:inline xmlns:a="http://schemas.openxmlformats.org/drawingml/2006/main" xmlns:pic="http://schemas.openxmlformats.org/drawingml/2006/picture">
+            <wp:extent cx="5715000" cy="3025588"/>
+            <wp:docPr id="6" name="Picture 6"/>
+            <wp:cNvGraphicFramePr>
+              <a:graphicFrameLocks noChangeAspect="1"/>
+            </wp:cNvGraphicFramePr>
+            <a:graphic>
+              <a:graphicData uri="http://schemas.openxmlformats.org/drawingml/2006/picture">
+                <pic:pic>
+                  <pic:nvPicPr>
+                    <pic:cNvPr id="0" name="06_control_outcome_heatmap.png"/>
+                    <pic:cNvPicPr/>
+                  </pic:nvPicPr>
+                  <pic:blipFill>
+                    <a:blip r:embed="rId15"/>
+                    <a:stretch>
+                      <a:fillRect/>
+                    </a:stretch>
+                  </pic:blipFill>
+                  <pic:spPr>
+                    <a:xfrm>
+                      <a:off x="0" y="0"/>
+                      <a:ext cx="5715000" cy="3025588"/>
+                    </a:xfrm>
+                    <a:prstGeom prst="rect"/>
+                  </pic:spPr>
+                </pic:pic>
+              </a:graphicData>
+            </a:graphic>
+          </wp:inline>
+        </w:drawing>
+      </w:r>
+    </w:p>
+    <w:p>
+      <w:pPr>
+        <w:keepLines/>
+        <w:spacing w:before="100" w:after="200"/>
+        <w:jc w:val="center"/>
+      </w:pPr>
+      <w:r>
+        <w:rPr>
+          <w:i/>
+          <w:color w:val="4B5763"/>
+          <w:sz w:val="18"/>
+        </w:rPr>
+        <w:t>Figure 6. Outcome heatmap. Red represents modeled exposure; teal represents DAI drops. Each count column uses its own scale.</w:t>
+      </w:r>
+    </w:p>
+    <w:p>
+      <w:pPr>
+        <w:pStyle w:val="Heading3"/>
+        <w:keepNext/>
+      </w:pPr>
+      <w:r>
+        <w:t>Code and run materials</w:t>
+      </w:r>
+    </w:p>
+    <w:p>
+      <w:r>
+        <w:t xml:space="preserve">The public repository includes the source, run instructions, CSV/JSON outputs, all six figures, the simulation run log and this report. Repository: </w:t>
+      </w:r>
+      <w:hyperlink r:id="rId16">
+        <w:r>
+          <w:rPr>
+            <w:color w:val="0563C1"/>
+            <w:u w:val="single"/>
+          </w:rPr>
+          <w:t>TuRing-82/secure-networks-arp-mitm-case-study</w:t>
+        </w:r>
+      </w:hyperlink>
     </w:p>
     <w:p>
       <w:pPr>

</xml_diff>